<commit_message>
Updated plots and added images
</commit_message>
<xml_diff>
--- a/MiniProjectReportTemplate.docx
+++ b/MiniProjectReportTemplate.docx
@@ -40,6 +40,13 @@
         </w:rPr>
         <w:t xml:space="preserve"> </w:t>
       </w:r>
+      <w:r>
+        <w:rPr>
+          <w:b/>
+          <w:bCs/>
+        </w:rPr>
+        <w:t>Pranav Srivastava</w:t>
+      </w:r>
     </w:p>
     <w:p>
       <w:pPr>
@@ -59,6 +66,13 @@
         </w:rPr>
         <w:t xml:space="preserve"> </w:t>
       </w:r>
+      <w:r>
+        <w:rPr>
+          <w:b/>
+          <w:bCs/>
+        </w:rPr>
+        <w:t>sriva176</w:t>
+      </w:r>
     </w:p>
     <w:p>
       <w:pPr>
@@ -87,6 +101,13 @@
         </w:rPr>
         <w:t xml:space="preserve"> </w:t>
       </w:r>
+      <w:r>
+        <w:rPr>
+          <w:b/>
+          <w:bCs/>
+        </w:rPr>
+        <w:t>Austin Lierman</w:t>
+      </w:r>
     </w:p>
     <w:p>
       <w:pPr>
@@ -106,6 +127,15 @@
         </w:rPr>
         <w:t xml:space="preserve"> </w:t>
       </w:r>
+      <w:proofErr w:type="spellStart"/>
+      <w:r>
+        <w:rPr>
+          <w:b/>
+          <w:bCs/>
+        </w:rPr>
+        <w:t>alierman</w:t>
+      </w:r>
+      <w:proofErr w:type="spellEnd"/>
     </w:p>
     <w:p>
       <w:pPr>
@@ -134,6 +164,13 @@
         </w:rPr>
         <w:t xml:space="preserve">, 2, or 3): </w:t>
       </w:r>
+      <w:r>
+        <w:rPr>
+          <w:b/>
+          <w:bCs/>
+        </w:rPr>
+        <w:t>2</w:t>
+      </w:r>
     </w:p>
     <w:p>
       <w:pPr>
@@ -173,15 +210,80 @@
           <w:szCs w:val="28"/>
         </w:rPr>
       </w:pPr>
-    </w:p>
-    <w:p>
-      <w:pPr>
-        <w:spacing w:line="240" w:lineRule="auto"/>
-        <w:rPr>
-          <w:sz w:val="28"/>
-          <w:szCs w:val="28"/>
-        </w:rPr>
-      </w:pPr>
+      <w:r>
+        <w:rPr>
+          <w:sz w:val="28"/>
+          <w:szCs w:val="28"/>
+        </w:rPr>
+        <w:t xml:space="preserve">We use </w:t>
+      </w:r>
+      <w:r>
+        <w:rPr>
+          <w:sz w:val="28"/>
+          <w:szCs w:val="28"/>
+        </w:rPr>
+        <w:t>nyc_bicycle_counts_2016.csv</w:t>
+      </w:r>
+      <w:r>
+        <w:rPr>
+          <w:sz w:val="28"/>
+          <w:szCs w:val="28"/>
+        </w:rPr>
+        <w:t>, which contains bicycle traffic count data in New York City from April 1</w:t>
+      </w:r>
+      <w:r>
+        <w:rPr>
+          <w:sz w:val="28"/>
+          <w:szCs w:val="28"/>
+          <w:vertAlign w:val="superscript"/>
+        </w:rPr>
+        <w:t>st</w:t>
+      </w:r>
+      <w:r>
+        <w:rPr>
+          <w:sz w:val="28"/>
+          <w:szCs w:val="28"/>
+        </w:rPr>
+        <w:t xml:space="preserve"> of 2016 to October 31</w:t>
+      </w:r>
+      <w:r>
+        <w:rPr>
+          <w:sz w:val="28"/>
+          <w:szCs w:val="28"/>
+          <w:vertAlign w:val="superscript"/>
+        </w:rPr>
+        <w:t>st</w:t>
+      </w:r>
+      <w:r>
+        <w:rPr>
+          <w:sz w:val="28"/>
+          <w:szCs w:val="28"/>
+        </w:rPr>
+        <w:t xml:space="preserve"> of 2016. Each row represents a day. There are 10 columns: Date, Day of Week, High Temp, Low Temp, </w:t>
+      </w:r>
+      <w:r>
+        <w:rPr>
+          <w:sz w:val="28"/>
+          <w:szCs w:val="28"/>
+        </w:rPr>
+        <w:t>Precipitation, Brooklyn Bridge, Manhattan Bridge, Williamsburg Bridge, Queensboro Bridge, and Total.</w:t>
+      </w:r>
+    </w:p>
+    <w:p>
+      <w:pPr>
+        <w:spacing w:line="240" w:lineRule="auto"/>
+        <w:rPr>
+          <w:sz w:val="28"/>
+          <w:szCs w:val="28"/>
+        </w:rPr>
+      </w:pPr>
+      <w:r>
+        <w:rPr>
+          <w:sz w:val="28"/>
+          <w:szCs w:val="28"/>
+        </w:rPr>
+        <w:t>The weather columns describe the daily temperature and how much precipitation there was. The bridge columns describe how much traffic was on each bridge, and total is the combined traffic of all the bridges. Some of the data was stored with comma formatting, so part of our data cleaning involved removing commas to make the values numerical</w:t>
+      </w:r>
     </w:p>
     <w:p>
       <w:pPr>
@@ -225,19 +327,183 @@
       <w:pPr>
         <w:spacing w:line="240" w:lineRule="auto"/>
         <w:rPr>
-          <w:sz w:val="28"/>
-          <w:szCs w:val="28"/>
-        </w:rPr>
-      </w:pPr>
-    </w:p>
-    <w:p>
-      <w:pPr>
-        <w:spacing w:line="240" w:lineRule="auto"/>
-        <w:rPr>
-          <w:sz w:val="28"/>
-          <w:szCs w:val="28"/>
-        </w:rPr>
-      </w:pPr>
+          <w:b/>
+          <w:bCs/>
+          <w:sz w:val="28"/>
+          <w:szCs w:val="28"/>
+        </w:rPr>
+      </w:pPr>
+      <w:r>
+        <w:rPr>
+          <w:b/>
+          <w:bCs/>
+          <w:sz w:val="28"/>
+          <w:szCs w:val="28"/>
+        </w:rPr>
+        <w:t>Question 1:</w:t>
+      </w:r>
+    </w:p>
+    <w:p>
+      <w:pPr>
+        <w:spacing w:line="240" w:lineRule="auto"/>
+        <w:rPr>
+          <w:sz w:val="28"/>
+          <w:szCs w:val="28"/>
+        </w:rPr>
+      </w:pPr>
+      <w:r>
+        <w:rPr>
+          <w:sz w:val="28"/>
+          <w:szCs w:val="28"/>
+        </w:rPr>
+        <w:t xml:space="preserve">We used linear regression to determine which of the bridges should receive sensors which used the total bicycle traffic from a subset of three bridge counts. Each model used three of the four bridge count columns as features while the target variable was Total. We evaluated the four possible three bridge sets by dropping one bridge and using a separate model. The model used an 80/20 train/test split with </w:t>
+      </w:r>
+      <w:proofErr w:type="spellStart"/>
+      <w:r>
+        <w:rPr>
+          <w:sz w:val="28"/>
+          <w:szCs w:val="28"/>
+        </w:rPr>
+        <w:t>random_state</w:t>
+      </w:r>
+      <w:proofErr w:type="spellEnd"/>
+      <w:r>
+        <w:rPr>
+          <w:sz w:val="28"/>
+          <w:szCs w:val="28"/>
+        </w:rPr>
+        <w:t xml:space="preserve"> = 42, which we compared using R^2 and the MSE. Linear regression is appropriate because Total is a contiguous variable and is related to the sum of the individual bridge counts. We expected the least useful bridge to be the one whose traffic volume was lowest.</w:t>
+      </w:r>
+    </w:p>
+    <w:p>
+      <w:pPr>
+        <w:spacing w:line="240" w:lineRule="auto"/>
+        <w:rPr>
+          <w:b/>
+          <w:bCs/>
+          <w:sz w:val="28"/>
+          <w:szCs w:val="28"/>
+        </w:rPr>
+      </w:pPr>
+    </w:p>
+    <w:p>
+      <w:pPr>
+        <w:spacing w:line="240" w:lineRule="auto"/>
+        <w:rPr>
+          <w:sz w:val="28"/>
+          <w:szCs w:val="28"/>
+        </w:rPr>
+      </w:pPr>
+      <w:r>
+        <w:rPr>
+          <w:b/>
+          <w:bCs/>
+          <w:sz w:val="28"/>
+          <w:szCs w:val="28"/>
+        </w:rPr>
+        <w:lastRenderedPageBreak/>
+        <w:t>Question 2:</w:t>
+      </w:r>
+    </w:p>
+    <w:p>
+      <w:pPr>
+        <w:spacing w:line="240" w:lineRule="auto"/>
+        <w:rPr>
+          <w:sz w:val="28"/>
+          <w:szCs w:val="28"/>
+        </w:rPr>
+      </w:pPr>
+      <w:proofErr w:type="gramStart"/>
+      <w:r>
+        <w:rPr>
+          <w:sz w:val="28"/>
+          <w:szCs w:val="28"/>
+        </w:rPr>
+        <w:t>In order to</w:t>
+      </w:r>
+      <w:proofErr w:type="gramEnd"/>
+      <w:r>
+        <w:rPr>
+          <w:sz w:val="28"/>
+          <w:szCs w:val="28"/>
+        </w:rPr>
+        <w:t xml:space="preserve"> test whether the next day weather forecasts would predict total ridership, we used linear regression with inputs High Temp, Low Temp, and Precipitation and Total as the target variable. We used an 80/20 train/test with </w:t>
+      </w:r>
+      <w:proofErr w:type="spellStart"/>
+      <w:r>
+        <w:rPr>
+          <w:sz w:val="28"/>
+          <w:szCs w:val="28"/>
+        </w:rPr>
+        <w:t>random_state</w:t>
+      </w:r>
+      <w:proofErr w:type="spellEnd"/>
+      <w:r>
+        <w:rPr>
+          <w:sz w:val="28"/>
+          <w:szCs w:val="28"/>
+        </w:rPr>
+        <w:t xml:space="preserve"> = 42 again, using R^2, MSE, and RMSE. We expected higher temperatures to be associated with higher ridership and more precipitation to reduce ridership. We used linear regression because the relationship between temperature and outdoor activity is linear over the range in the dataset and the coefficients have a direct interpretation of each weathers effect.</w:t>
+      </w:r>
+    </w:p>
+    <w:p>
+      <w:pPr>
+        <w:spacing w:line="240" w:lineRule="auto"/>
+        <w:rPr>
+          <w:sz w:val="28"/>
+          <w:szCs w:val="28"/>
+        </w:rPr>
+      </w:pPr>
+    </w:p>
+    <w:p>
+      <w:pPr>
+        <w:spacing w:line="240" w:lineRule="auto"/>
+        <w:rPr>
+          <w:sz w:val="28"/>
+          <w:szCs w:val="28"/>
+        </w:rPr>
+      </w:pPr>
+      <w:r>
+        <w:rPr>
+          <w:b/>
+          <w:bCs/>
+          <w:sz w:val="28"/>
+          <w:szCs w:val="28"/>
+        </w:rPr>
+        <w:t>Question 3:</w:t>
+      </w:r>
+    </w:p>
+    <w:p>
+      <w:pPr>
+        <w:spacing w:line="240" w:lineRule="auto"/>
+        <w:rPr>
+          <w:sz w:val="28"/>
+          <w:szCs w:val="28"/>
+        </w:rPr>
+      </w:pPr>
+      <w:r>
+        <w:rPr>
+          <w:sz w:val="28"/>
+          <w:szCs w:val="28"/>
+        </w:rPr>
+        <w:t xml:space="preserve">We analyzed weekly traffic patterns by using day of the week and calculating the mean total bicycle traffic for each day. We plotted these averages as a bar chart with the days Monday through Sunday. This allowed us to see the patterns in the days of the week. We used 4 classifiers, Logistic Regression, K-Nearest Neighbors, Decision Tree, and Random Forest to predict the day of the week as integers from 0 through 6. We tested all classifiers so their accuracy could be compared directly. Using an 80/20 train/test split with </w:t>
+      </w:r>
+      <w:proofErr w:type="spellStart"/>
+      <w:r>
+        <w:rPr>
+          <w:sz w:val="28"/>
+          <w:szCs w:val="28"/>
+        </w:rPr>
+        <w:t>random_state</w:t>
+      </w:r>
+      <w:proofErr w:type="spellEnd"/>
+      <w:r>
+        <w:rPr>
+          <w:sz w:val="28"/>
+          <w:szCs w:val="28"/>
+        </w:rPr>
+        <w:t xml:space="preserve"> = 42, for reproducibility. Since there are only 214 rows across the 7 classes, we expect the accuracy to be very limited, specifically for distinguishing adjacent weekdays that have similar traffic profiles. We expect weekend days to be easier to classify correctly since they have significantly lower average counts.</w:t>
+      </w:r>
     </w:p>
     <w:p>
       <w:pPr>
@@ -281,28 +547,737 @@
       <w:pPr>
         <w:spacing w:line="240" w:lineRule="auto"/>
         <w:rPr>
-          <w:sz w:val="28"/>
-          <w:szCs w:val="28"/>
-        </w:rPr>
-      </w:pPr>
-    </w:p>
-    <w:p>
-      <w:pPr>
-        <w:spacing w:line="240" w:lineRule="auto"/>
-        <w:rPr>
-          <w:sz w:val="28"/>
-          <w:szCs w:val="28"/>
-        </w:rPr>
-      </w:pPr>
-    </w:p>
-    <w:p>
-      <w:pPr>
-        <w:spacing w:line="240" w:lineRule="auto"/>
-        <w:rPr>
-          <w:sz w:val="28"/>
-          <w:szCs w:val="28"/>
-        </w:rPr>
-      </w:pPr>
+          <w:b/>
+          <w:bCs/>
+          <w:sz w:val="28"/>
+          <w:szCs w:val="28"/>
+        </w:rPr>
+      </w:pPr>
+      <w:r>
+        <w:rPr>
+          <w:b/>
+          <w:bCs/>
+          <w:sz w:val="28"/>
+          <w:szCs w:val="28"/>
+        </w:rPr>
+        <w:t>Question 1</w:t>
+      </w:r>
+      <w:r>
+        <w:rPr>
+          <w:b/>
+          <w:bCs/>
+          <w:sz w:val="28"/>
+          <w:szCs w:val="28"/>
+        </w:rPr>
+        <w:t>:</w:t>
+      </w:r>
+    </w:p>
+    <w:p>
+      <w:pPr>
+        <w:spacing w:line="240" w:lineRule="auto"/>
+        <w:rPr>
+          <w:sz w:val="28"/>
+          <w:szCs w:val="28"/>
+        </w:rPr>
+      </w:pPr>
+      <w:r>
+        <w:rPr>
+          <w:sz w:val="28"/>
+          <w:szCs w:val="28"/>
+        </w:rPr>
+        <w:t>The best performing three-bridge subset was the one containing the Brooklyn Bridge, Manhattan Bridge, and Williamsburg Bridge meaning Queensboro Bridge should be the one that we leave without a sensor. The test results were:</w:t>
+      </w:r>
+    </w:p>
+    <w:p>
+      <w:pPr>
+        <w:spacing w:line="240" w:lineRule="auto"/>
+        <w:rPr>
+          <w:sz w:val="28"/>
+          <w:szCs w:val="28"/>
+        </w:rPr>
+      </w:pPr>
+    </w:p>
+    <w:tbl>
+      <w:tblPr>
+        <w:tblStyle w:val="GridTable1Light"/>
+        <w:tblW w:w="0" w:type="auto"/>
+        <w:tblLook w:val="04A0" w:firstRow="1" w:lastRow="0" w:firstColumn="1" w:lastColumn="0" w:noHBand="0" w:noVBand="1"/>
+      </w:tblPr>
+      <w:tblGrid>
+        <w:gridCol w:w="2337"/>
+        <w:gridCol w:w="2337"/>
+        <w:gridCol w:w="2338"/>
+        <w:gridCol w:w="2338"/>
+      </w:tblGrid>
+      <w:tr>
+        <w:trPr>
+          <w:cnfStyle w:val="100000000000" w:firstRow="1" w:lastRow="0" w:firstColumn="0" w:lastColumn="0" w:oddVBand="0" w:evenVBand="0" w:oddHBand="0" w:evenHBand="0" w:firstRowFirstColumn="0" w:firstRowLastColumn="0" w:lastRowFirstColumn="0" w:lastRowLastColumn="0"/>
+        </w:trPr>
+        <w:tc>
+          <w:tcPr>
+            <w:cnfStyle w:val="001000000000" w:firstRow="0" w:lastRow="0" w:firstColumn="1" w:lastColumn="0" w:oddVBand="0" w:evenVBand="0" w:oddHBand="0" w:evenHBand="0" w:firstRowFirstColumn="0" w:firstRowLastColumn="0" w:lastRowFirstColumn="0" w:lastRowLastColumn="0"/>
+            <w:tcW w:w="2337" w:type="dxa"/>
+          </w:tcPr>
+          <w:p>
+            <w:pPr>
+              <w:jc w:val="center"/>
+              <w:rPr>
+                <w:sz w:val="28"/>
+                <w:szCs w:val="28"/>
+              </w:rPr>
+            </w:pPr>
+            <w:r>
+              <w:rPr>
+                <w:sz w:val="28"/>
+                <w:szCs w:val="28"/>
+              </w:rPr>
+              <w:t>Bridges Used</w:t>
+            </w:r>
+          </w:p>
+        </w:tc>
+        <w:tc>
+          <w:tcPr>
+            <w:tcW w:w="2337" w:type="dxa"/>
+          </w:tcPr>
+          <w:p>
+            <w:pPr>
+              <w:jc w:val="center"/>
+              <w:cnfStyle w:val="100000000000" w:firstRow="1" w:lastRow="0" w:firstColumn="0" w:lastColumn="0" w:oddVBand="0" w:evenVBand="0" w:oddHBand="0" w:evenHBand="0" w:firstRowFirstColumn="0" w:firstRowLastColumn="0" w:lastRowFirstColumn="0" w:lastRowLastColumn="0"/>
+              <w:rPr>
+                <w:sz w:val="28"/>
+                <w:szCs w:val="28"/>
+              </w:rPr>
+            </w:pPr>
+            <w:r>
+              <w:rPr>
+                <w:sz w:val="28"/>
+                <w:szCs w:val="28"/>
+              </w:rPr>
+              <w:t>Bridge Left Out</w:t>
+            </w:r>
+          </w:p>
+        </w:tc>
+        <w:tc>
+          <w:tcPr>
+            <w:tcW w:w="2338" w:type="dxa"/>
+          </w:tcPr>
+          <w:p>
+            <w:pPr>
+              <w:jc w:val="center"/>
+              <w:cnfStyle w:val="100000000000" w:firstRow="1" w:lastRow="0" w:firstColumn="0" w:lastColumn="0" w:oddVBand="0" w:evenVBand="0" w:oddHBand="0" w:evenHBand="0" w:firstRowFirstColumn="0" w:firstRowLastColumn="0" w:lastRowFirstColumn="0" w:lastRowLastColumn="0"/>
+              <w:rPr>
+                <w:sz w:val="28"/>
+                <w:szCs w:val="28"/>
+                <w:vertAlign w:val="superscript"/>
+              </w:rPr>
+            </w:pPr>
+            <w:r>
+              <w:rPr>
+                <w:sz w:val="28"/>
+                <w:szCs w:val="28"/>
+              </w:rPr>
+              <w:t>R</w:t>
+            </w:r>
+            <w:r>
+              <w:rPr>
+                <w:sz w:val="28"/>
+                <w:szCs w:val="28"/>
+                <w:vertAlign w:val="superscript"/>
+              </w:rPr>
+              <w:t>2</w:t>
+            </w:r>
+          </w:p>
+        </w:tc>
+        <w:tc>
+          <w:tcPr>
+            <w:tcW w:w="2338" w:type="dxa"/>
+          </w:tcPr>
+          <w:p>
+            <w:pPr>
+              <w:jc w:val="center"/>
+              <w:cnfStyle w:val="100000000000" w:firstRow="1" w:lastRow="0" w:firstColumn="0" w:lastColumn="0" w:oddVBand="0" w:evenVBand="0" w:oddHBand="0" w:evenHBand="0" w:firstRowFirstColumn="0" w:firstRowLastColumn="0" w:lastRowFirstColumn="0" w:lastRowLastColumn="0"/>
+              <w:rPr>
+                <w:sz w:val="28"/>
+                <w:szCs w:val="28"/>
+              </w:rPr>
+            </w:pPr>
+            <w:r>
+              <w:rPr>
+                <w:sz w:val="28"/>
+                <w:szCs w:val="28"/>
+              </w:rPr>
+              <w:t>MSE</w:t>
+            </w:r>
+          </w:p>
+        </w:tc>
+      </w:tr>
+      <w:tr>
+        <w:tc>
+          <w:tcPr>
+            <w:cnfStyle w:val="001000000000" w:firstRow="0" w:lastRow="0" w:firstColumn="1" w:lastColumn="0" w:oddVBand="0" w:evenVBand="0" w:oddHBand="0" w:evenHBand="0" w:firstRowFirstColumn="0" w:firstRowLastColumn="0" w:lastRowFirstColumn="0" w:lastRowLastColumn="0"/>
+            <w:tcW w:w="2337" w:type="dxa"/>
+          </w:tcPr>
+          <w:p>
+            <w:pPr>
+              <w:rPr>
+                <w:b w:val="0"/>
+                <w:bCs w:val="0"/>
+                <w:sz w:val="28"/>
+                <w:szCs w:val="28"/>
+              </w:rPr>
+            </w:pPr>
+            <w:r>
+              <w:rPr>
+                <w:b w:val="0"/>
+                <w:bCs w:val="0"/>
+                <w:sz w:val="28"/>
+                <w:szCs w:val="28"/>
+              </w:rPr>
+              <w:t>Manhattan, Williamsburg, Queensboro</w:t>
+            </w:r>
+          </w:p>
+        </w:tc>
+        <w:tc>
+          <w:tcPr>
+            <w:tcW w:w="2337" w:type="dxa"/>
+          </w:tcPr>
+          <w:p>
+            <w:pPr>
+              <w:cnfStyle w:val="000000000000" w:firstRow="0" w:lastRow="0" w:firstColumn="0" w:lastColumn="0" w:oddVBand="0" w:evenVBand="0" w:oddHBand="0" w:evenHBand="0" w:firstRowFirstColumn="0" w:firstRowLastColumn="0" w:lastRowFirstColumn="0" w:lastRowLastColumn="0"/>
+              <w:rPr>
+                <w:sz w:val="28"/>
+                <w:szCs w:val="28"/>
+              </w:rPr>
+            </w:pPr>
+            <w:r>
+              <w:rPr>
+                <w:sz w:val="28"/>
+                <w:szCs w:val="28"/>
+              </w:rPr>
+              <w:t>Brooklyn</w:t>
+            </w:r>
+          </w:p>
+        </w:tc>
+        <w:tc>
+          <w:tcPr>
+            <w:tcW w:w="2338" w:type="dxa"/>
+          </w:tcPr>
+          <w:p>
+            <w:pPr>
+              <w:cnfStyle w:val="000000000000" w:firstRow="0" w:lastRow="0" w:firstColumn="0" w:lastColumn="0" w:oddVBand="0" w:evenVBand="0" w:oddHBand="0" w:evenHBand="0" w:firstRowFirstColumn="0" w:firstRowLastColumn="0" w:lastRowFirstColumn="0" w:lastRowLastColumn="0"/>
+              <w:rPr>
+                <w:sz w:val="28"/>
+                <w:szCs w:val="28"/>
+              </w:rPr>
+            </w:pPr>
+            <w:r>
+              <w:rPr>
+                <w:sz w:val="28"/>
+                <w:szCs w:val="28"/>
+              </w:rPr>
+              <w:t>0.9831</w:t>
+            </w:r>
+          </w:p>
+        </w:tc>
+        <w:tc>
+          <w:tcPr>
+            <w:tcW w:w="2338" w:type="dxa"/>
+          </w:tcPr>
+          <w:p>
+            <w:pPr>
+              <w:cnfStyle w:val="000000000000" w:firstRow="0" w:lastRow="0" w:firstColumn="0" w:lastColumn="0" w:oddVBand="0" w:evenVBand="0" w:oddHBand="0" w:evenHBand="0" w:firstRowFirstColumn="0" w:firstRowLastColumn="0" w:lastRowFirstColumn="0" w:lastRowLastColumn="0"/>
+              <w:rPr>
+                <w:sz w:val="28"/>
+                <w:szCs w:val="28"/>
+              </w:rPr>
+            </w:pPr>
+            <w:r>
+              <w:rPr>
+                <w:sz w:val="28"/>
+                <w:szCs w:val="28"/>
+              </w:rPr>
+              <w:t>697,676.76</w:t>
+            </w:r>
+          </w:p>
+        </w:tc>
+      </w:tr>
+      <w:tr>
+        <w:tc>
+          <w:tcPr>
+            <w:cnfStyle w:val="001000000000" w:firstRow="0" w:lastRow="0" w:firstColumn="1" w:lastColumn="0" w:oddVBand="0" w:evenVBand="0" w:oddHBand="0" w:evenHBand="0" w:firstRowFirstColumn="0" w:firstRowLastColumn="0" w:lastRowFirstColumn="0" w:lastRowLastColumn="0"/>
+            <w:tcW w:w="2337" w:type="dxa"/>
+          </w:tcPr>
+          <w:p>
+            <w:pPr>
+              <w:rPr>
+                <w:b w:val="0"/>
+                <w:bCs w:val="0"/>
+                <w:sz w:val="28"/>
+                <w:szCs w:val="28"/>
+              </w:rPr>
+            </w:pPr>
+            <w:r>
+              <w:rPr>
+                <w:b w:val="0"/>
+                <w:bCs w:val="0"/>
+                <w:sz w:val="28"/>
+                <w:szCs w:val="28"/>
+              </w:rPr>
+              <w:lastRenderedPageBreak/>
+              <w:t>Brooklyn, Williamsburg, Queensboro</w:t>
+            </w:r>
+          </w:p>
+        </w:tc>
+        <w:tc>
+          <w:tcPr>
+            <w:tcW w:w="2337" w:type="dxa"/>
+          </w:tcPr>
+          <w:p>
+            <w:pPr>
+              <w:cnfStyle w:val="000000000000" w:firstRow="0" w:lastRow="0" w:firstColumn="0" w:lastColumn="0" w:oddVBand="0" w:evenVBand="0" w:oddHBand="0" w:evenHBand="0" w:firstRowFirstColumn="0" w:firstRowLastColumn="0" w:lastRowFirstColumn="0" w:lastRowLastColumn="0"/>
+              <w:rPr>
+                <w:sz w:val="28"/>
+                <w:szCs w:val="28"/>
+              </w:rPr>
+            </w:pPr>
+            <w:r>
+              <w:rPr>
+                <w:sz w:val="28"/>
+                <w:szCs w:val="28"/>
+              </w:rPr>
+              <w:t>Manhattan</w:t>
+            </w:r>
+          </w:p>
+        </w:tc>
+        <w:tc>
+          <w:tcPr>
+            <w:tcW w:w="2338" w:type="dxa"/>
+          </w:tcPr>
+          <w:p>
+            <w:pPr>
+              <w:cnfStyle w:val="000000000000" w:firstRow="0" w:lastRow="0" w:firstColumn="0" w:lastColumn="0" w:oddVBand="0" w:evenVBand="0" w:oddHBand="0" w:evenHBand="0" w:firstRowFirstColumn="0" w:firstRowLastColumn="0" w:lastRowFirstColumn="0" w:lastRowLastColumn="0"/>
+              <w:rPr>
+                <w:sz w:val="28"/>
+                <w:szCs w:val="28"/>
+              </w:rPr>
+            </w:pPr>
+            <w:r>
+              <w:rPr>
+                <w:sz w:val="28"/>
+                <w:szCs w:val="28"/>
+              </w:rPr>
+              <w:t>0.9856</w:t>
+            </w:r>
+          </w:p>
+        </w:tc>
+        <w:tc>
+          <w:tcPr>
+            <w:tcW w:w="2338" w:type="dxa"/>
+          </w:tcPr>
+          <w:p>
+            <w:pPr>
+              <w:cnfStyle w:val="000000000000" w:firstRow="0" w:lastRow="0" w:firstColumn="0" w:lastColumn="0" w:oddVBand="0" w:evenVBand="0" w:oddHBand="0" w:evenHBand="0" w:firstRowFirstColumn="0" w:firstRowLastColumn="0" w:lastRowFirstColumn="0" w:lastRowLastColumn="0"/>
+              <w:rPr>
+                <w:sz w:val="28"/>
+                <w:szCs w:val="28"/>
+              </w:rPr>
+            </w:pPr>
+            <w:r>
+              <w:rPr>
+                <w:sz w:val="28"/>
+                <w:szCs w:val="28"/>
+              </w:rPr>
+              <w:t>592,865.58</w:t>
+            </w:r>
+          </w:p>
+        </w:tc>
+      </w:tr>
+      <w:tr>
+        <w:tc>
+          <w:tcPr>
+            <w:cnfStyle w:val="001000000000" w:firstRow="0" w:lastRow="0" w:firstColumn="1" w:lastColumn="0" w:oddVBand="0" w:evenVBand="0" w:oddHBand="0" w:evenHBand="0" w:firstRowFirstColumn="0" w:firstRowLastColumn="0" w:lastRowFirstColumn="0" w:lastRowLastColumn="0"/>
+            <w:tcW w:w="2337" w:type="dxa"/>
+          </w:tcPr>
+          <w:p>
+            <w:pPr>
+              <w:rPr>
+                <w:b w:val="0"/>
+                <w:bCs w:val="0"/>
+                <w:sz w:val="28"/>
+                <w:szCs w:val="28"/>
+              </w:rPr>
+            </w:pPr>
+            <w:r>
+              <w:rPr>
+                <w:b w:val="0"/>
+                <w:bCs w:val="0"/>
+                <w:sz w:val="28"/>
+                <w:szCs w:val="28"/>
+              </w:rPr>
+              <w:t>Brooklyn, Manhattan, Queensboro</w:t>
+            </w:r>
+          </w:p>
+        </w:tc>
+        <w:tc>
+          <w:tcPr>
+            <w:tcW w:w="2337" w:type="dxa"/>
+          </w:tcPr>
+          <w:p>
+            <w:pPr>
+              <w:cnfStyle w:val="000000000000" w:firstRow="0" w:lastRow="0" w:firstColumn="0" w:lastColumn="0" w:oddVBand="0" w:evenVBand="0" w:oddHBand="0" w:evenHBand="0" w:firstRowFirstColumn="0" w:firstRowLastColumn="0" w:lastRowFirstColumn="0" w:lastRowLastColumn="0"/>
+              <w:rPr>
+                <w:sz w:val="28"/>
+                <w:szCs w:val="28"/>
+              </w:rPr>
+            </w:pPr>
+            <w:r>
+              <w:rPr>
+                <w:sz w:val="28"/>
+                <w:szCs w:val="28"/>
+              </w:rPr>
+              <w:t>Williamsburg</w:t>
+            </w:r>
+          </w:p>
+        </w:tc>
+        <w:tc>
+          <w:tcPr>
+            <w:tcW w:w="2338" w:type="dxa"/>
+          </w:tcPr>
+          <w:p>
+            <w:pPr>
+              <w:cnfStyle w:val="000000000000" w:firstRow="0" w:lastRow="0" w:firstColumn="0" w:lastColumn="0" w:oddVBand="0" w:evenVBand="0" w:oddHBand="0" w:evenHBand="0" w:firstRowFirstColumn="0" w:firstRowLastColumn="0" w:lastRowFirstColumn="0" w:lastRowLastColumn="0"/>
+              <w:rPr>
+                <w:sz w:val="28"/>
+                <w:szCs w:val="28"/>
+              </w:rPr>
+            </w:pPr>
+            <w:r>
+              <w:rPr>
+                <w:sz w:val="28"/>
+                <w:szCs w:val="28"/>
+              </w:rPr>
+              <w:t>0.9960</w:t>
+            </w:r>
+          </w:p>
+        </w:tc>
+        <w:tc>
+          <w:tcPr>
+            <w:tcW w:w="2338" w:type="dxa"/>
+          </w:tcPr>
+          <w:p>
+            <w:pPr>
+              <w:cnfStyle w:val="000000000000" w:firstRow="0" w:lastRow="0" w:firstColumn="0" w:lastColumn="0" w:oddVBand="0" w:evenVBand="0" w:oddHBand="0" w:evenHBand="0" w:firstRowFirstColumn="0" w:firstRowLastColumn="0" w:lastRowFirstColumn="0" w:lastRowLastColumn="0"/>
+              <w:rPr>
+                <w:sz w:val="28"/>
+                <w:szCs w:val="28"/>
+              </w:rPr>
+            </w:pPr>
+            <w:r>
+              <w:rPr>
+                <w:sz w:val="28"/>
+                <w:szCs w:val="28"/>
+              </w:rPr>
+              <w:t>164,725.04</w:t>
+            </w:r>
+          </w:p>
+        </w:tc>
+      </w:tr>
+      <w:tr>
+        <w:tc>
+          <w:tcPr>
+            <w:cnfStyle w:val="001000000000" w:firstRow="0" w:lastRow="0" w:firstColumn="1" w:lastColumn="0" w:oddVBand="0" w:evenVBand="0" w:oddHBand="0" w:evenHBand="0" w:firstRowFirstColumn="0" w:firstRowLastColumn="0" w:lastRowFirstColumn="0" w:lastRowLastColumn="0"/>
+            <w:tcW w:w="2337" w:type="dxa"/>
+          </w:tcPr>
+          <w:p>
+            <w:pPr>
+              <w:rPr>
+                <w:b w:val="0"/>
+                <w:bCs w:val="0"/>
+                <w:sz w:val="28"/>
+                <w:szCs w:val="28"/>
+              </w:rPr>
+            </w:pPr>
+            <w:r>
+              <w:rPr>
+                <w:b w:val="0"/>
+                <w:bCs w:val="0"/>
+                <w:sz w:val="28"/>
+                <w:szCs w:val="28"/>
+              </w:rPr>
+              <w:t>Brooklyn, Manhattan, Williamsburg</w:t>
+            </w:r>
+          </w:p>
+        </w:tc>
+        <w:tc>
+          <w:tcPr>
+            <w:tcW w:w="2337" w:type="dxa"/>
+          </w:tcPr>
+          <w:p>
+            <w:pPr>
+              <w:cnfStyle w:val="000000000000" w:firstRow="0" w:lastRow="0" w:firstColumn="0" w:lastColumn="0" w:oddVBand="0" w:evenVBand="0" w:oddHBand="0" w:evenHBand="0" w:firstRowFirstColumn="0" w:firstRowLastColumn="0" w:lastRowFirstColumn="0" w:lastRowLastColumn="0"/>
+              <w:rPr>
+                <w:sz w:val="28"/>
+                <w:szCs w:val="28"/>
+              </w:rPr>
+            </w:pPr>
+            <w:r>
+              <w:rPr>
+                <w:sz w:val="28"/>
+                <w:szCs w:val="28"/>
+              </w:rPr>
+              <w:t>Queensboro</w:t>
+            </w:r>
+          </w:p>
+        </w:tc>
+        <w:tc>
+          <w:tcPr>
+            <w:tcW w:w="2338" w:type="dxa"/>
+          </w:tcPr>
+          <w:p>
+            <w:pPr>
+              <w:cnfStyle w:val="000000000000" w:firstRow="0" w:lastRow="0" w:firstColumn="0" w:lastColumn="0" w:oddVBand="0" w:evenVBand="0" w:oddHBand="0" w:evenHBand="0" w:firstRowFirstColumn="0" w:firstRowLastColumn="0" w:lastRowFirstColumn="0" w:lastRowLastColumn="0"/>
+              <w:rPr>
+                <w:sz w:val="28"/>
+                <w:szCs w:val="28"/>
+              </w:rPr>
+            </w:pPr>
+            <w:r>
+              <w:rPr>
+                <w:sz w:val="28"/>
+                <w:szCs w:val="28"/>
+              </w:rPr>
+              <w:t>0.9976</w:t>
+            </w:r>
+          </w:p>
+        </w:tc>
+        <w:tc>
+          <w:tcPr>
+            <w:tcW w:w="2338" w:type="dxa"/>
+          </w:tcPr>
+          <w:p>
+            <w:pPr>
+              <w:cnfStyle w:val="000000000000" w:firstRow="0" w:lastRow="0" w:firstColumn="0" w:lastColumn="0" w:oddVBand="0" w:evenVBand="0" w:oddHBand="0" w:evenHBand="0" w:firstRowFirstColumn="0" w:firstRowLastColumn="0" w:lastRowFirstColumn="0" w:lastRowLastColumn="0"/>
+              <w:rPr>
+                <w:sz w:val="28"/>
+                <w:szCs w:val="28"/>
+              </w:rPr>
+            </w:pPr>
+            <w:r>
+              <w:rPr>
+                <w:sz w:val="28"/>
+                <w:szCs w:val="28"/>
+              </w:rPr>
+              <w:t>9</w:t>
+            </w:r>
+            <w:r>
+              <w:rPr>
+                <w:sz w:val="28"/>
+                <w:szCs w:val="28"/>
+              </w:rPr>
+              <w:t>7,363.42</w:t>
+            </w:r>
+          </w:p>
+        </w:tc>
+      </w:tr>
+    </w:tbl>
+    <w:p>
+      <w:pPr>
+        <w:spacing w:line="240" w:lineRule="auto"/>
+        <w:rPr>
+          <w:sz w:val="28"/>
+          <w:szCs w:val="28"/>
+        </w:rPr>
+      </w:pPr>
+    </w:p>
+    <w:p>
+      <w:pPr>
+        <w:spacing w:line="240" w:lineRule="auto"/>
+        <w:rPr>
+          <w:sz w:val="28"/>
+          <w:szCs w:val="28"/>
+        </w:rPr>
+      </w:pPr>
+      <w:r>
+        <w:rPr>
+          <w:sz w:val="28"/>
+          <w:szCs w:val="28"/>
+        </w:rPr>
+        <w:t>From this, we recommend that the sensors should be put on the three bridges aside from the Queensboro bridge. This is because when we tested it, this subset gave us the highest R</w:t>
+      </w:r>
+      <w:r>
+        <w:rPr>
+          <w:sz w:val="28"/>
+          <w:szCs w:val="28"/>
+          <w:vertAlign w:val="superscript"/>
+        </w:rPr>
+        <w:t>2</w:t>
+      </w:r>
+      <w:r>
+        <w:rPr>
+          <w:sz w:val="28"/>
+          <w:szCs w:val="28"/>
+        </w:rPr>
+        <w:t xml:space="preserve"> value while also having the lowest MSE value out of all the subsets. Our fitted coefficients were 1.193 for the Brooklyn Bridge, 0.943 for the Manhattan Bridge, and 1.592 for the Williamsburg Bridge, and an intercept of 360.06. The Queensboro Bridge giving us the least information makes the most sense, as it is also the bridge with the least traffic out of all four. Removing it would give us the smallest performance drop because its contribution to the total </w:t>
+      </w:r>
+      <w:r>
+        <w:rPr>
+          <w:sz w:val="28"/>
+          <w:szCs w:val="28"/>
+        </w:rPr>
+        <w:t>would be more predictable from the other bridges</w:t>
+      </w:r>
+    </w:p>
+    <w:p>
+      <w:pPr>
+        <w:spacing w:line="240" w:lineRule="auto"/>
+        <w:rPr>
+          <w:sz w:val="28"/>
+          <w:szCs w:val="28"/>
+        </w:rPr>
+      </w:pPr>
+    </w:p>
+    <w:p>
+      <w:pPr>
+        <w:spacing w:line="240" w:lineRule="auto"/>
+        <w:rPr>
+          <w:sz w:val="28"/>
+          <w:szCs w:val="28"/>
+        </w:rPr>
+      </w:pPr>
+      <w:r>
+        <w:rPr>
+          <w:b/>
+          <w:bCs/>
+          <w:sz w:val="28"/>
+          <w:szCs w:val="28"/>
+        </w:rPr>
+        <w:t>Question 2:</w:t>
+      </w:r>
+    </w:p>
+    <w:p>
+      <w:pPr>
+        <w:spacing w:line="240" w:lineRule="auto"/>
+        <w:rPr>
+          <w:sz w:val="28"/>
+          <w:szCs w:val="28"/>
+        </w:rPr>
+      </w:pPr>
+      <w:r>
+        <w:rPr>
+          <w:sz w:val="28"/>
+          <w:szCs w:val="28"/>
+        </w:rPr>
+        <w:t>The fitted weather model gave us the following coefficients: 380.09 for High Temp, -177.04 for Low Temp, -8681.59 for Precipitation, and 1896.02 for our intercept. The testing R</w:t>
+      </w:r>
+      <w:r>
+        <w:rPr>
+          <w:sz w:val="28"/>
+          <w:szCs w:val="28"/>
+          <w:vertAlign w:val="superscript"/>
+        </w:rPr>
+        <w:t>2</w:t>
+      </w:r>
+      <w:r>
+        <w:rPr>
+          <w:sz w:val="28"/>
+          <w:szCs w:val="28"/>
+        </w:rPr>
+        <w:t xml:space="preserve"> was 0.575, the MSE was 17, 498,379, and the RMSE was 4,183.</w:t>
+      </w:r>
+    </w:p>
+    <w:p>
+      <w:pPr>
+        <w:spacing w:line="240" w:lineRule="auto"/>
+        <w:rPr>
+          <w:sz w:val="28"/>
+          <w:szCs w:val="28"/>
+        </w:rPr>
+      </w:pPr>
+      <w:r>
+        <w:rPr>
+          <w:sz w:val="28"/>
+          <w:szCs w:val="28"/>
+        </w:rPr>
+        <w:t xml:space="preserve">The positive coefficient of high temp and the negative coefficient of precipitation </w:t>
+      </w:r>
+      <w:proofErr w:type="gramStart"/>
+      <w:r>
+        <w:rPr>
+          <w:sz w:val="28"/>
+          <w:szCs w:val="28"/>
+        </w:rPr>
+        <w:t>makes</w:t>
+      </w:r>
+      <w:proofErr w:type="gramEnd"/>
+      <w:r>
+        <w:rPr>
+          <w:sz w:val="28"/>
+          <w:szCs w:val="28"/>
+        </w:rPr>
+        <w:t xml:space="preserve"> sense with the idea that warmer and drier days would mean more cyclists. The negative coefficient of Low Temp is explained by the fact that High Temp and Low Temp are correlated with each other, and so the model would offset their effects when fitting, so the fact that the Low Temp coefficient is negative should not be </w:t>
+      </w:r>
+      <w:proofErr w:type="gramStart"/>
+      <w:r>
+        <w:rPr>
+          <w:sz w:val="28"/>
+          <w:szCs w:val="28"/>
+        </w:rPr>
+        <w:t>taken into account</w:t>
+      </w:r>
+      <w:proofErr w:type="gramEnd"/>
+      <w:r>
+        <w:rPr>
+          <w:sz w:val="28"/>
+          <w:szCs w:val="28"/>
+        </w:rPr>
+        <w:t xml:space="preserve"> by itself</w:t>
+      </w:r>
+    </w:p>
+    <w:p>
+      <w:pPr>
+        <w:spacing w:line="240" w:lineRule="auto"/>
+        <w:rPr>
+          <w:sz w:val="28"/>
+          <w:szCs w:val="28"/>
+        </w:rPr>
+      </w:pPr>
+      <w:r>
+        <w:rPr>
+          <w:sz w:val="28"/>
+          <w:szCs w:val="28"/>
+        </w:rPr>
+        <w:t>The R</w:t>
+      </w:r>
+      <w:r>
+        <w:rPr>
+          <w:sz w:val="28"/>
+          <w:szCs w:val="28"/>
+          <w:vertAlign w:val="superscript"/>
+        </w:rPr>
+        <w:t>2</w:t>
+      </w:r>
+      <w:r>
+        <w:rPr>
+          <w:sz w:val="28"/>
+          <w:szCs w:val="28"/>
+        </w:rPr>
+        <w:t xml:space="preserve"> value of 0.575 means that 57.5% of the </w:t>
+      </w:r>
+      <w:r>
+        <w:rPr>
+          <w:sz w:val="28"/>
+          <w:szCs w:val="28"/>
+        </w:rPr>
+        <w:t xml:space="preserve">changes in bike traffic is explained by the weather. The weather by itself shouldn’t be reliable enough by itself for police decisions because the model doesn’t account for any day-of-week patterns in the data (which Question 3 says have significance), or any seasonal trends </w:t>
+      </w:r>
+      <w:r>
+        <w:rPr>
+          <w:sz w:val="28"/>
+          <w:szCs w:val="28"/>
+        </w:rPr>
+        <w:lastRenderedPageBreak/>
+        <w:t xml:space="preserve">between April and October, or any other special external factors that could make a difference. </w:t>
+      </w:r>
     </w:p>
     <w:sectPr>
       <w:pgSz w:w="12240" w:h="15840"/>
@@ -1231,6 +2206,82 @@
       <w:spacing w:val="5"/>
     </w:rPr>
   </w:style>
+  <w:style w:type="table" w:styleId="TableGrid">
+    <w:name w:val="Table Grid"/>
+    <w:basedOn w:val="TableNormal"/>
+    <w:uiPriority w:val="39"/>
+    <w:rsid w:val="00C25837"/>
+    <w:pPr>
+      <w:spacing w:after="0" w:line="240" w:lineRule="auto"/>
+    </w:pPr>
+    <w:tblPr>
+      <w:tblBorders>
+        <w:top w:val="single" w:sz="4" w:space="0" w:color="auto"/>
+        <w:left w:val="single" w:sz="4" w:space="0" w:color="auto"/>
+        <w:bottom w:val="single" w:sz="4" w:space="0" w:color="auto"/>
+        <w:right w:val="single" w:sz="4" w:space="0" w:color="auto"/>
+        <w:insideH w:val="single" w:sz="4" w:space="0" w:color="auto"/>
+        <w:insideV w:val="single" w:sz="4" w:space="0" w:color="auto"/>
+      </w:tblBorders>
+    </w:tblPr>
+  </w:style>
+  <w:style w:type="table" w:styleId="GridTable1Light">
+    <w:name w:val="Grid Table 1 Light"/>
+    <w:basedOn w:val="TableNormal"/>
+    <w:uiPriority w:val="46"/>
+    <w:rsid w:val="00C25837"/>
+    <w:pPr>
+      <w:spacing w:after="0" w:line="240" w:lineRule="auto"/>
+    </w:pPr>
+    <w:tblPr>
+      <w:tblStyleRowBandSize w:val="1"/>
+      <w:tblStyleColBandSize w:val="1"/>
+      <w:tblBorders>
+        <w:top w:val="single" w:sz="4" w:space="0" w:color="999999" w:themeColor="text1" w:themeTint="66"/>
+        <w:left w:val="single" w:sz="4" w:space="0" w:color="999999" w:themeColor="text1" w:themeTint="66"/>
+        <w:bottom w:val="single" w:sz="4" w:space="0" w:color="999999" w:themeColor="text1" w:themeTint="66"/>
+        <w:right w:val="single" w:sz="4" w:space="0" w:color="999999" w:themeColor="text1" w:themeTint="66"/>
+        <w:insideH w:val="single" w:sz="4" w:space="0" w:color="999999" w:themeColor="text1" w:themeTint="66"/>
+        <w:insideV w:val="single" w:sz="4" w:space="0" w:color="999999" w:themeColor="text1" w:themeTint="66"/>
+      </w:tblBorders>
+    </w:tblPr>
+    <w:tblStylePr w:type="firstRow">
+      <w:rPr>
+        <w:b/>
+        <w:bCs/>
+      </w:rPr>
+      <w:tblPr/>
+      <w:tcPr>
+        <w:tcBorders>
+          <w:bottom w:val="single" w:sz="12" w:space="0" w:color="666666" w:themeColor="text1" w:themeTint="99"/>
+        </w:tcBorders>
+      </w:tcPr>
+    </w:tblStylePr>
+    <w:tblStylePr w:type="lastRow">
+      <w:rPr>
+        <w:b/>
+        <w:bCs/>
+      </w:rPr>
+      <w:tblPr/>
+      <w:tcPr>
+        <w:tcBorders>
+          <w:top w:val="double" w:sz="2" w:space="0" w:color="666666" w:themeColor="text1" w:themeTint="99"/>
+        </w:tcBorders>
+      </w:tcPr>
+    </w:tblStylePr>
+    <w:tblStylePr w:type="firstCol">
+      <w:rPr>
+        <w:b/>
+        <w:bCs/>
+      </w:rPr>
+    </w:tblStylePr>
+    <w:tblStylePr w:type="lastCol">
+      <w:rPr>
+        <w:b/>
+        <w:bCs/>
+      </w:rPr>
+    </w:tblStylePr>
+  </w:style>
 </w:styles>
 </file>
 

</xml_diff>